<commit_message>
Update assessment report with December chart
</commit_message>
<xml_diff>
--- a/assessment_report.docx
+++ b/assessment_report.docx
@@ -42,17 +42,7 @@
           <w:sz w:val="32"/>
           <w:szCs w:val="32"/>
         </w:rPr>
-        <w:t xml:space="preserve">Machine Learning Engineer </w:t>
-      </w:r>
-      <w:r>
-        <w:rPr>
-          <w:rFonts w:asciiTheme="minorBidi" w:hAnsiTheme="minorBidi" w:cstheme="minorBidi"/>
-          <w:b/>
-          <w:bCs/>
-          <w:sz w:val="32"/>
-          <w:szCs w:val="32"/>
-        </w:rPr>
-        <w:t>Assessment (Spotter)</w:t>
+        <w:t>Machine Learning Engineer Assessment (Spotter)</w:t>
       </w:r>
     </w:p>
     <w:p>
@@ -198,23 +188,7 @@
           <w:b/>
           <w:bCs/>
         </w:rPr>
-        <w:t xml:space="preserve">January 1, </w:t>
-      </w:r>
-      <w:r>
-        <w:rPr>
-          <w:rFonts w:asciiTheme="minorBidi" w:hAnsiTheme="minorBidi"/>
-          <w:b/>
-          <w:bCs/>
-        </w:rPr>
-        <w:t>2025,</w:t>
-      </w:r>
-      <w:r>
-        <w:rPr>
-          <w:rFonts w:asciiTheme="minorBidi" w:hAnsiTheme="minorBidi"/>
-          <w:b/>
-          <w:bCs/>
-        </w:rPr>
-        <w:t xml:space="preserve"> to October 31, 2025</w:t>
+        <w:t>January 1, 2025, to October 31, 2025</w:t>
       </w:r>
       <w:r>
         <w:rPr>
@@ -796,19 +770,7 @@
         <w:rPr>
           <w:rFonts w:asciiTheme="minorBidi" w:hAnsiTheme="minorBidi"/>
         </w:rPr>
-        <w:t xml:space="preserve"> from model training and was used to evaluate how well the models could generalize </w:t>
-      </w:r>
-      <w:r>
-        <w:rPr>
-          <w:rFonts w:asciiTheme="minorBidi" w:hAnsiTheme="minorBidi"/>
-        </w:rPr>
-        <w:t>for</w:t>
-      </w:r>
-      <w:r>
-        <w:rPr>
-          <w:rFonts w:asciiTheme="minorBidi" w:hAnsiTheme="minorBidi"/>
-        </w:rPr>
-        <w:t xml:space="preserve"> a future period.</w:t>
+        <w:t xml:space="preserve"> from model training and was used to evaluate how well the models could generalize for a future period.</w:t>
       </w:r>
     </w:p>
     <w:p>
@@ -1966,23 +1928,7 @@
           <w:b/>
           <w:bCs/>
         </w:rPr>
-        <w:t xml:space="preserve">November 1, </w:t>
-      </w:r>
-      <w:r>
-        <w:rPr>
-          <w:rFonts w:asciiTheme="minorBidi" w:hAnsiTheme="minorBidi"/>
-          <w:b/>
-          <w:bCs/>
-        </w:rPr>
-        <w:t>2025,</w:t>
-      </w:r>
-      <w:r>
-        <w:rPr>
-          <w:rFonts w:asciiTheme="minorBidi" w:hAnsiTheme="minorBidi"/>
-          <w:b/>
-          <w:bCs/>
-        </w:rPr>
-        <w:t xml:space="preserve"> through December 31, 2025</w:t>
+        <w:t>November 1, 2025, through December 31, 2025</w:t>
       </w:r>
       <w:r>
         <w:rPr>
@@ -2800,6 +2746,71 @@
       <w:pPr>
         <w:rPr>
           <w:rFonts w:asciiTheme="minorBidi" w:hAnsiTheme="minorBidi"/>
+          <w:rtl/>
+        </w:rPr>
+      </w:pPr>
+      <w:r>
+        <w:rPr>
+          <w:rFonts w:asciiTheme="minorBidi" w:hAnsiTheme="minorBidi"/>
+          <w:noProof/>
+          <w:rtl/>
+          <w:lang w:val="ar-SA"/>
+        </w:rPr>
+        <w:drawing>
+          <wp:inline distT="0" distB="0" distL="0" distR="0" wp14:anchorId="33A7E7E5" wp14:editId="5035944F">
+            <wp:extent cx="5943600" cy="2952750"/>
+            <wp:effectExtent l="0" t="0" r="0" b="0"/>
+            <wp:docPr id="1117984368" name="Picture 1"/>
+            <wp:cNvGraphicFramePr>
+              <a:graphicFrameLocks xmlns:a="http://schemas.openxmlformats.org/drawingml/2006/main" noChangeAspect="1"/>
+            </wp:cNvGraphicFramePr>
+            <a:graphic xmlns:a="http://schemas.openxmlformats.org/drawingml/2006/main">
+              <a:graphicData uri="http://schemas.openxmlformats.org/drawingml/2006/picture">
+                <pic:pic xmlns:pic="http://schemas.openxmlformats.org/drawingml/2006/picture">
+                  <pic:nvPicPr>
+                    <pic:cNvPr id="1117984368" name="Picture 1117984368"/>
+                    <pic:cNvPicPr/>
+                  </pic:nvPicPr>
+                  <pic:blipFill>
+                    <a:blip r:embed="rId5">
+                      <a:extLst>
+                        <a:ext uri="{28A0092B-C50C-407E-A947-70E740481C1C}">
+                          <a14:useLocalDpi xmlns:a14="http://schemas.microsoft.com/office/drawing/2010/main" val="0"/>
+                        </a:ext>
+                      </a:extLst>
+                    </a:blip>
+                    <a:stretch>
+                      <a:fillRect/>
+                    </a:stretch>
+                  </pic:blipFill>
+                  <pic:spPr>
+                    <a:xfrm>
+                      <a:off x="0" y="0"/>
+                      <a:ext cx="5943600" cy="2952750"/>
+                    </a:xfrm>
+                    <a:prstGeom prst="rect">
+                      <a:avLst/>
+                    </a:prstGeom>
+                  </pic:spPr>
+                </pic:pic>
+              </a:graphicData>
+            </a:graphic>
+          </wp:inline>
+        </w:drawing>
+      </w:r>
+    </w:p>
+    <w:p>
+      <w:pPr>
+        <w:rPr>
+          <w:rFonts w:asciiTheme="minorBidi" w:hAnsiTheme="minorBidi"/>
+          <w:rtl/>
+        </w:rPr>
+      </w:pPr>
+    </w:p>
+    <w:p>
+      <w:pPr>
+        <w:rPr>
+          <w:rFonts w:asciiTheme="minorBidi" w:hAnsiTheme="minorBidi"/>
           <w:b/>
           <w:bCs/>
           <w:sz w:val="28"/>
@@ -2937,7 +2948,6 @@
         <w:rPr>
           <w:rFonts w:asciiTheme="minorBidi" w:hAnsiTheme="minorBidi"/>
         </w:rPr>
-        <w:lastRenderedPageBreak/>
         <w:t>The final validation metrics for the unseen validation loads are calculated by Spotter after submission.</w:t>
       </w:r>
     </w:p>
@@ -3075,6 +3085,7 @@
           <w:b/>
           <w:bCs/>
         </w:rPr>
+        <w:lastRenderedPageBreak/>
         <w:t>Prepared by Sara Shawabka</w:t>
       </w:r>
       <w:r>
@@ -3102,7 +3113,7 @@
     <w:p>
       <w:pPr>
         <w:rPr>
-          <w:rFonts w:asciiTheme="minorBidi" w:hAnsiTheme="minorBidi" w:hint="cs"/>
+          <w:rFonts w:asciiTheme="minorBidi" w:hAnsiTheme="minorBidi"/>
           <w:rtl/>
           <w:lang w:bidi="ar-JO"/>
         </w:rPr>
@@ -5260,6 +5271,7 @@
   <w:style w:type="character" w:default="1" w:styleId="DefaultParagraphFont">
     <w:name w:val="Default Paragraph Font"/>
     <w:uiPriority w:val="1"/>
+    <w:semiHidden/>
     <w:unhideWhenUsed/>
   </w:style>
   <w:style w:type="table" w:default="1" w:styleId="TableNormal">

</xml_diff>